<commit_message>
docs: corrige section 4 checklist (RHEL non sourcé, RAM/vCPU/IOPS à confirmer) + variante sans annexe
RHEL 9.4+ n'était sourcé nulle part (ni aap-facts.md, ni doc RH accessible) ; reformulé en
"à confirmer côté Red Hat" plutôt que d'affirmer un chiffre. RAM/vCPU/IOPS déjà notés hors
périmètre du sourçage stockage : reformulés en ordre de grandeur à confirmer. 60/15/10 Go
restent des exigences fermes (sourcés). Ajoute une variante sans l'annexe technique pour
l'envoi aux équipes (annexe conservée dans le document complet, projet).

Co-Authored-By: Claude Sonnet 5 <noreply@anthropic.com>
</commit_message>
<xml_diff>
--- a/docs/AAP_2.6_prerequis_infra_par_equipe.docx
+++ b/docs/AAP_2.6_prerequis_infra_par_equipe.docx
@@ -724,7 +724,7 @@
         <w:t xml:space="preserve">Sous quelle forme : </w:t>
       </w:r>
       <w:r>
-        <w:t>Confirmer que chaque VM dispose d'au moins : 60 Go de disque total, dont ≥ 15 Go pour le répertoire d'installation et ≥ 10 Go libres sur /tmp (extraction du paquet hors ligne) ; 16 Go de RAM ; 4 vCPU ; ~3000 IOPS. Identique PROD et QUAL.</w:t>
+        <w:t>Confirmer que chaque VM dispose d'au moins : 60 Go de disque total, dont ≥ 15 Go pour le répertoire d'installation et ≥ 10 Go libres sur /tmp (extraction du paquet hors ligne) — ces trois valeurs sont des exigences fermes sur les prérequis système Red Hat. À titre d'ordre de grandeur à confirmer côté Red Hat (non sourcé avec la même rigueur que le disque) : ~16 Go de RAM, ~4 vCPU, ~3000 IOPS. Identique PROD et QUAL.</w:t>
       </w:r>
     </w:p>
     <w:p>
@@ -740,7 +740,7 @@
         <w:t xml:space="preserve">Pourquoi : </w:t>
       </w:r>
       <w:r>
-        <w:t>Un disque ou un /tmp sous-dimensionné fait échouer l'installation ; notre étape de préparation vérifie l'espace libre et bloque si insuffisant. (Valeurs issues des prérequis système Red Hat.)</w:t>
+        <w:t>Un disque ou un /tmp sous-dimensionné fait échouer l'installation ; notre étape de préparation vérifie l'espace libre et bloque si insuffisant. (Seuils disque — 60/15/10 Go — sourcés sur la documentation système Red Hat AAP 2.6 containerized ; RAM/vCPU/IOPS restent à confirmer côté Red Hat.)</w:t>
       </w:r>
     </w:p>
     <w:p>
@@ -757,7 +757,7 @@
         <w:rPr>
           <w:b/>
         </w:rPr>
-        <w:t>Système de base des VM : RHEL 9.4+ avec l'outil de synchronisation d'horloge « chrony » présent dans l'image.</w:t>
+        <w:t>Système de base des VM : version RHEL à confirmer côté Red Hat pour AAP 2.6 containerized (ne pas supposer 9.4), avec l'outil de synchronisation d'horloge « chrony » présent dans l'image.</w:t>
       </w:r>
     </w:p>
     <w:p>
@@ -773,7 +773,7 @@
         <w:t xml:space="preserve">Sous quelle forme : </w:t>
       </w:r>
       <w:r>
-        <w:t>Confirmer la version RHEL (9.4 ou supérieur) et la présence de chrony dans l'image de base. PROD et QUAL.</w:t>
+        <w:t>Confirmer auprès de Red Hat la version RHEL exacte requise/supportée pour AAP 2.6 containerized, et la présence de chrony dans l'image de base. PROD et QUAL.</w:t>
       </w:r>
     </w:p>
     <w:p>

</xml_diff>

<commit_message>
docs: source la version RHEL exacte (9.6+/RHEL10) depuis le bundle, corrige la checklist
RHEL 9.6+ (ou RHEL 10 + ansible-core 2.16) est un assert réel de l'installeur
(ansible.containerized_installer roles/preflight/tasks/nodes.yml:12-13 et core.yml:7),
trouvé hors ligne dans le bundle local — pas besoin du fetch web qui échouait (403).
Remplace "à confirmer" par l'exigence sourcée dans les 2 .docx, avec commentaire Word
interne citant la source. RAM/vCPU/IOPS non touchés (hors périmètre, restent "à confirmer").

Co-Authored-By: Claude Sonnet 5 <noreply@anthropic.com>
</commit_message>
<xml_diff>
--- a/docs/AAP_2.6_prerequis_infra_par_equipe.docx
+++ b/docs/AAP_2.6_prerequis_infra_par_equipe.docx
@@ -753,11 +753,19 @@
         </w:rPr>
         <w:t xml:space="preserve">☐  </w:t>
       </w:r>
+      <w:commentRangeStart w:id="0"/>
       <w:r>
         <w:rPr>
           <w:b/>
         </w:rPr>
-        <w:t>Système de base des VM : version RHEL à confirmer côté Red Hat pour AAP 2.6 containerized (ne pas supposer 9.4), avec l'outil de synchronisation d'horloge « chrony » présent dans l'image.</w:t>
+        <w:t>Système de base des VM : RHEL 9.6+ (ou RHEL 10, avec ansible-core 2.16) avec l'outil de synchronisation d'horloge « chrony » présent dans l'image.</w:t>
+      </w:r>
+      <w:commentRangeEnd w:id="0"/>
+      <w:r>
+        <w:rPr>
+          <w:rStyle w:val="CommentReference"/>
+        </w:rPr>
+        <w:commentReference w:id="0"/>
       </w:r>
     </w:p>
     <w:p>
@@ -773,7 +781,7 @@
         <w:t xml:space="preserve">Sous quelle forme : </w:t>
       </w:r>
       <w:r>
-        <w:t>Confirmer auprès de Red Hat la version RHEL exacte requise/supportée pour AAP 2.6 containerized, et la présence de chrony dans l'image de base. PROD et QUAL.</w:t>
+        <w:t>Confirmer la version RHEL (9.6 ou supérieur, ou RHEL 10) et la présence de chrony dans l'image de base. PROD et QUAL.</w:t>
       </w:r>
     </w:p>
     <w:p>
@@ -1743,6 +1751,27 @@
 </w:document>
 </file>
 
+<file path=word/comments.xml><?xml version="1.0" encoding="utf-8"?>
+<w:comments xmlns:a="http://schemas.openxmlformats.org/drawingml/2006/main" xmlns:pic="http://schemas.openxmlformats.org/drawingml/2006/picture" xmlns:r="http://schemas.openxmlformats.org/officeDocument/2006/relationships" xmlns:w="http://schemas.openxmlformats.org/wordprocessingml/2006/main" xmlns:wp="http://schemas.openxmlformats.org/drawingml/2006/wordprocessingDrawing" xmlns:mc="http://schemas.openxmlformats.org/markup-compatibility/2006" xmlns:a14="http://schemas.microsoft.com/office/drawing/2010/main" xmlns:w14="http://schemas.microsoft.com/office/word/2010/wordml" xmlns:wpc="http://schemas.microsoft.com/office/word/2010/wordprocessingCanvas">
+  <w:comment w:id="0" w:author="aap-automation (préparation)" w:initials="AAP" w:date="2026-07-16T12:45:30Z">
+    <w:p>
+      <w:pPr>
+        <w:pStyle w:val="CommentText"/>
+      </w:pPr>
+      <w:r>
+        <w:rPr>
+          <w:rStyle w:val="CommentReference"/>
+        </w:rPr>
+        <w:annotationRef/>
+      </w:r>
+      <w:r>
+        <w:t>Source : collection ansible.containerized_installer, roles/preflight/tasks/nodes.yml:12-13 (assert 'Only Red Hat Enterprise Linux 9.6+ distributions are supported') + roles/preflight/tasks/core.yml:7 ('RHEL 9 with Ansible 2.14 or RHEL 10 with Ansible 2.16'). Bundle 2.6-10.1-x86_64.</w:t>
+      </w:r>
+    </w:p>
+  </w:comment>
+</w:comments>
+</file>
+
 <file path=word/numbering.xml><?xml version="1.0" encoding="utf-8"?>
 <w:numbering xmlns:wpc="http://schemas.microsoft.com/office/word/2010/wordprocessingCanvas" xmlns:mo="http://schemas.microsoft.com/office/mac/office/2008/main" xmlns:mc="http://schemas.openxmlformats.org/markup-compatibility/2006" xmlns:mv="urn:schemas-microsoft-com:mac:vml" xmlns:o="urn:schemas-microsoft-com:office:office" xmlns:r="http://schemas.openxmlformats.org/officeDocument/2006/relationships" xmlns:m="http://schemas.openxmlformats.org/officeDocument/2006/math" xmlns:v="urn:schemas-microsoft-com:vml" xmlns:wp14="http://schemas.microsoft.com/office/word/2010/wordprocessingDrawing" xmlns:wp="http://schemas.openxmlformats.org/drawingml/2006/wordprocessingDrawing" xmlns:w10="urn:schemas-microsoft-com:office:word" xmlns:w="http://schemas.openxmlformats.org/wordprocessingml/2006/main" xmlns:w14="http://schemas.microsoft.com/office/word/2010/wordml" xmlns:wpg="http://schemas.microsoft.com/office/word/2010/wordprocessingGroup" xmlns:wpi="http://schemas.microsoft.com/office/word/2010/wordprocessingInk" xmlns:wne="http://schemas.microsoft.com/office/word/2006/wordml" xmlns:wps="http://schemas.microsoft.com/office/word/2010/wordprocessingShape" mc:Ignorable="w14 wp14">
   <w:abstractNum w:abstractNumId="0">

</xml_diff>

<commit_message>
docs: requalifie la RAM (16 Go) en exigence sourcée, distincte de vCPU/IOPS à confirmer
roles/preflight/tasks/nodes.yml:15-22 (ansible.containerized_installer) contient un assert
réel ansible_memtotal_mb >= 15000 ("Required RAM is 16GB") : même niveau de certitude que
le disque et RHEL 9.6+. Section 4 des 2 .docx restructurée pour distinguer visuellement
(labels en gras) les exigences vérifiées par l'installeur (disque, RHEL, RAM) des ordres
de grandeur non vérifiés (vCPU, IOPS) — aucun assert bundle ne les couvre. Commentaire Word
interne ajouté citant la source + la nuance hop-node exempté du garde RAM.

Co-Authored-By: Claude Sonnet 5 <noreply@anthropic.com>
</commit_message>
<xml_diff>
--- a/docs/AAP_2.6_prerequis_infra_par_equipe.docx
+++ b/docs/AAP_2.6_prerequis_infra_par_equipe.docx
@@ -723,8 +723,44 @@
         </w:rPr>
         <w:t xml:space="preserve">Sous quelle forme : </w:t>
       </w:r>
+      <w:r/>
       <w:r>
-        <w:t>Confirmer que chaque VM dispose d'au moins : 60 Go de disque total, dont ≥ 15 Go pour le répertoire d'installation et ≥ 10 Go libres sur /tmp (extraction du paquet hors ligne) — ces trois valeurs sont des exigences fermes sur les prérequis système Red Hat. À titre d'ordre de grandeur à confirmer côté Red Hat (non sourcé avec la même rigueur que le disque) : ~16 Go de RAM, ~4 vCPU, ~3000 IOPS. Identique PROD et QUAL.</w:t>
+        <w:rPr>
+          <w:b w:val="0"/>
+        </w:rPr>
+        <w:t xml:space="preserve">Confirmer que chaque VM dispose d'au moins — </w:t>
+      </w:r>
+      <w:r>
+        <w:rPr>
+          <w:b/>
+        </w:rPr>
+        <w:t>exigences vérifiées par l'installeur</w:t>
+      </w:r>
+      <w:commentRangeStart w:id="1"/>
+      <w:r>
+        <w:rPr>
+          <w:b w:val="0"/>
+        </w:rPr>
+        <w:t xml:space="preserve"> : 60 Go de disque total, dont ≥ 15 Go pour le répertoire d'installation et ≥ 10 Go libres sur /tmp (extraction du paquet hors ligne), et ≥ 16 Go de RAM. </w:t>
+      </w:r>
+      <w:commentRangeEnd w:id="1"/>
+      <w:r>
+        <w:rPr>
+          <w:rStyle w:val="CommentReference"/>
+        </w:rPr>
+        <w:commentReference w:id="1"/>
+      </w:r>
+      <w:r>
+        <w:rPr>
+          <w:b/>
+        </w:rPr>
+        <w:t>Ordre de grandeur à confirmer côté Red Hat</w:t>
+      </w:r>
+      <w:r>
+        <w:rPr>
+          <w:b w:val="0"/>
+        </w:rPr>
+        <w:t xml:space="preserve"> (non vérifié par l'installeur) : ~4 vCPU, ~3000 IOPS. Identique PROD et QUAL.</w:t>
       </w:r>
     </w:p>
     <w:p>
@@ -740,7 +776,7 @@
         <w:t xml:space="preserve">Pourquoi : </w:t>
       </w:r>
       <w:r>
-        <w:t>Un disque ou un /tmp sous-dimensionné fait échouer l'installation ; notre étape de préparation vérifie l'espace libre et bloque si insuffisant. (Seuils disque — 60/15/10 Go — sourcés sur la documentation système Red Hat AAP 2.6 containerized ; RAM/vCPU/IOPS restent à confirmer côté Red Hat.)</w:t>
+        <w:t>Un disque, un /tmp ou une RAM insuffisants font échouer l'installation — pour la RAM, l'installeur refuse de démarrer (assert dédié) ; notre étape de préparation vérifie l'espace disque libre et bloque si insuffisant. (60/15/10 Go sourcés sur la documentation système Red Hat AAP 2.6 containerized ; 16 Go RAM sourcé sur l'assert réel de l'installeur ; vCPU/IOPS restent à confirmer côté Red Hat, aucun seuil vérifié par l'installeur.)</w:t>
       </w:r>
     </w:p>
     <w:p>
@@ -1769,6 +1805,22 @@
       </w:r>
     </w:p>
   </w:comment>
+  <w:comment w:id="1" w:author="aap-automation (préparation)" w:initials="AAP" w:date="2026-07-16T12:50:24Z">
+    <w:p>
+      <w:pPr>
+        <w:pStyle w:val="CommentText"/>
+      </w:pPr>
+      <w:r>
+        <w:rPr>
+          <w:rStyle w:val="CommentReference"/>
+        </w:rPr>
+        <w:annotationRef/>
+      </w:r>
+      <w:r>
+        <w:t>Source : collection ansible.containerized_installer, roles/preflight/tasks/nodes.yml:15-22 (assert 'Fail if this machine lacks sufficient RAM', condition ansible_memtotal_mb &gt;= 15000 ligne 18, fail_msg 'Required RAM is 16GB' lignes 19-21). Nuance : ce garde est SKIPPÉ pour un nœud qui est UNIQUEMENT hop (receptor_type=hop ET group_names==['execution_nodes'], ligne 22) — n'affecte donc pas hop1 en topologie enterprise standard. Bundle 2.6-10.1-x86_64.</w:t>
+      </w:r>
+    </w:p>
+  </w:comment>
 </w:comments>
 </file>
 

</xml_diff>